<commit_message>
first version of most popular
</commit_message>
<xml_diff>
--- a/report_and_results/Recommender_Systems_Report.docx
+++ b/report_and_results/Recommender_Systems_Report.docx
@@ -251,31 +251,67 @@
           <w:iCs/>
           <w:color w:val="000000"/>
         </w:rPr>
-        <w:t>Keep the section headings below. You may add subsections where useful.</w:t>
+        <w:t xml:space="preserve">Keep the section headings below. You may add subsections </w:t>
       </w:r>
-    </w:p>
-    <w:p>
-      <w:pPr>
-        <w:numPr>
-          <w:ilvl w:val="0"/>
-          <w:numId w:val="1"/>
-        </w:numPr>
-        <w:pBdr>
-          <w:top w:val="nil"/>
-          <w:left w:val="nil"/>
-          <w:bottom w:val="nil"/>
-          <w:right w:val="nil"/>
-          <w:between w:val="nil"/>
-        </w:pBdr>
-        <w:spacing w:after="0"/>
-      </w:pPr>
+      <w:proofErr w:type="gramStart"/>
       <w:r>
         <w:rPr>
           <w:i/>
           <w:iCs/>
           <w:color w:val="000000"/>
         </w:rPr>
-        <w:t>All explanations and justifications requested in the project specification belong in this report.</w:t>
+        <w:t>where</w:t>
+      </w:r>
+      <w:proofErr w:type="gramEnd"/>
+      <w:r>
+        <w:rPr>
+          <w:i/>
+          <w:iCs/>
+          <w:color w:val="000000"/>
+        </w:rPr>
+        <w:t xml:space="preserve"> useful.</w:t>
+      </w:r>
+    </w:p>
+    <w:p>
+      <w:pPr>
+        <w:numPr>
+          <w:ilvl w:val="0"/>
+          <w:numId w:val="1"/>
+        </w:numPr>
+        <w:pBdr>
+          <w:top w:val="nil"/>
+          <w:left w:val="nil"/>
+          <w:bottom w:val="nil"/>
+          <w:right w:val="nil"/>
+          <w:between w:val="nil"/>
+        </w:pBdr>
+        <w:spacing w:after="0"/>
+      </w:pPr>
+      <w:r>
+        <w:rPr>
+          <w:i/>
+          <w:iCs/>
+          <w:color w:val="000000"/>
+        </w:rPr>
+        <w:t xml:space="preserve">All explanations and justifications requested in the project specification belong </w:t>
+      </w:r>
+      <w:proofErr w:type="gramStart"/>
+      <w:r>
+        <w:rPr>
+          <w:i/>
+          <w:iCs/>
+          <w:color w:val="000000"/>
+        </w:rPr>
+        <w:t>in</w:t>
+      </w:r>
+      <w:proofErr w:type="gramEnd"/>
+      <w:r>
+        <w:rPr>
+          <w:i/>
+          <w:iCs/>
+          <w:color w:val="000000"/>
+        </w:rPr>
+        <w:t xml:space="preserve"> this report.</w:t>
       </w:r>
     </w:p>
     <w:p>
@@ -347,7 +383,23 @@
           <w:i/>
           <w:iCs/>
         </w:rPr>
-        <w:t>Characterize the MovieLens 1M data as required in Part 1. Include the requested distributions/plots and discuss any non-obvious properties relevant to the experiments.</w:t>
+        <w:t xml:space="preserve">Characterize the </w:t>
+      </w:r>
+      <w:proofErr w:type="spellStart"/>
+      <w:r>
+        <w:rPr>
+          <w:i/>
+          <w:iCs/>
+        </w:rPr>
+        <w:t>MovieLens</w:t>
+      </w:r>
+      <w:proofErr w:type="spellEnd"/>
+      <w:r>
+        <w:rPr>
+          <w:i/>
+          <w:iCs/>
+        </w:rPr>
+        <w:t xml:space="preserve"> 1M data as required in Part 1. Include the requested distributions/plots and discuss any non-obvious properties relevant to the experiments.</w:t>
       </w:r>
     </w:p>
     <w:p>
@@ -359,12 +411,47 @@
       </w:r>
     </w:p>
     <w:p>
+      <w:pPr>
+        <w:rPr>
+          <w:i/>
+          <w:iCs/>
+        </w:rPr>
+      </w:pPr>
       <w:r>
         <w:rPr>
           <w:i/>
           <w:iCs/>
         </w:rPr>
         <w:t>Describe filtering, treatment of ratings/feedback, and any preprocessing decisions. Report thresholds and their effect on the data.</w:t>
+      </w:r>
+    </w:p>
+    <w:p>
+      <w:r>
+        <w:t xml:space="preserve">As noted in benchmark literature, </w:t>
+      </w:r>
+      <w:proofErr w:type="spellStart"/>
+      <w:r>
+        <w:t>MovieLens</w:t>
+      </w:r>
+      <w:proofErr w:type="spellEnd"/>
+      <w:r>
+        <w:t xml:space="preserve"> 1M exhibits a relatively high density compared to typical implicit feedback matrices, which often fall below 1%. To investigate the distribution of feedback, long-tail analyses of user and item activity were conducted. As discussed by Ricci, Rokach, and Shapira (2015/2022) in the Recommender Systems Handbook, recommender systems inherently suffer from a severe 'long tail' distribution, where a small fraction of popular items and active users accumulate </w:t>
+      </w:r>
+      <w:proofErr w:type="gramStart"/>
+      <w:r>
+        <w:t>the majority of</w:t>
+      </w:r>
+      <w:proofErr w:type="gramEnd"/>
+      <w:r>
+        <w:t xml:space="preserve"> interactions, leaving a vast tail of uninformative entries.  Low-activity users and items introduce </w:t>
+      </w:r>
+      <w:proofErr w:type="gramStart"/>
+      <w:r>
+        <w:t>noise</w:t>
+      </w:r>
+      <w:proofErr w:type="gramEnd"/>
+      <w:r>
+        <w:t xml:space="preserve"> and unreliable similarity estimates into collaborative filtering algorithms (Herlocker et al., 2004). To ensure data quality and stabilize the evaluation protocol, a targeted filtering threshold was applied, removing users with fewer than 25 ratings and movies with fewer than 5 ratings. This practice aligns with standard collaborative filtering preprocessing (Sarwar et al., 2001), successfully pruning uninformative tail entities while preserving over 99% of the total interaction data and resulting in an optimized matrix density of 5.16%.</w:t>
       </w:r>
     </w:p>
     <w:p>
@@ -389,6 +476,7 @@
         <w:pStyle w:val="Otsikko2"/>
       </w:pPr>
       <w:r>
+        <w:lastRenderedPageBreak/>
         <w:t>1.4 Evaluation protocol</w:t>
       </w:r>
     </w:p>
@@ -417,7 +505,39 @@
           <w:i/>
           <w:iCs/>
         </w:rPr>
-        <w:t>Describe item-based kNN and the Most Popular variants, including the settings that were evaluated. For item-based kNN, report and justify the selected neighborhood size k and similarity measure.</w:t>
+        <w:t xml:space="preserve">Describe item-based </w:t>
+      </w:r>
+      <w:proofErr w:type="spellStart"/>
+      <w:r>
+        <w:rPr>
+          <w:i/>
+          <w:iCs/>
+        </w:rPr>
+        <w:t>kNN</w:t>
+      </w:r>
+      <w:proofErr w:type="spellEnd"/>
+      <w:r>
+        <w:rPr>
+          <w:i/>
+          <w:iCs/>
+        </w:rPr>
+        <w:t xml:space="preserve"> and the Most Popular variants, including the settings that were evaluated. For item-based </w:t>
+      </w:r>
+      <w:proofErr w:type="spellStart"/>
+      <w:r>
+        <w:rPr>
+          <w:i/>
+          <w:iCs/>
+        </w:rPr>
+        <w:t>kNN</w:t>
+      </w:r>
+      <w:proofErr w:type="spellEnd"/>
+      <w:r>
+        <w:rPr>
+          <w:i/>
+          <w:iCs/>
+        </w:rPr>
+        <w:t>, report and justify the selected neighborhood size k and similarity measure.</w:t>
       </w:r>
     </w:p>
     <w:p>
@@ -442,7 +562,6 @@
         <w:pStyle w:val="Otsikko1"/>
       </w:pPr>
       <w:r>
-        <w:lastRenderedPageBreak/>
         <w:t>2. Part 2 - Models and Honest Comparison</w:t>
       </w:r>
     </w:p>
@@ -511,7 +630,23 @@
           <w:i/>
           <w:iCs/>
         </w:rPr>
-        <w:t>Report and interpret results broken down by at least two of the required dimensions: items with few vs. many training interactions, low- vs. high-activity users, popular vs. long-tail items, and early vs. late test period. Define any thresholds used and focus on findings that change or qualify the overall conclusions.</w:t>
+        <w:t xml:space="preserve">Report and interpret results </w:t>
+      </w:r>
+      <w:proofErr w:type="gramStart"/>
+      <w:r>
+        <w:rPr>
+          <w:i/>
+          <w:iCs/>
+        </w:rPr>
+        <w:t>broken</w:t>
+      </w:r>
+      <w:proofErr w:type="gramEnd"/>
+      <w:r>
+        <w:rPr>
+          <w:i/>
+          <w:iCs/>
+        </w:rPr>
+        <w:t xml:space="preserve"> down by at least two of the required dimensions: items with few vs. many training interactions, low- vs. high-activity users, popular vs. long-tail items, and early vs. late test period. Define any thresholds used and focus on findings that change or qualify the overall conclusions.</w:t>
       </w:r>
     </w:p>
     <w:p>
@@ -595,6 +730,7 @@
         <w:pStyle w:val="Otsikko3"/>
       </w:pPr>
       <w:r>
+        <w:lastRenderedPageBreak/>
         <w:t>If Track B - Fairness</w:t>
       </w:r>
     </w:p>
@@ -604,7 +740,23 @@
           <w:i/>
           <w:iCs/>
         </w:rPr>
-        <w:t>Define the release-decade provider proxy, report and justify the final decade boundaries and group sizes, state and justify the adopted fairness notion, describe the consumer groups based on MovieLens user attributes, and identify the stage and form of the mitigation.</w:t>
+        <w:t xml:space="preserve">Define the release-decade provider proxy, report and justify the final decade boundaries and group sizes, state and justify the adopted fairness notion, describe the consumer groups based on </w:t>
+      </w:r>
+      <w:proofErr w:type="spellStart"/>
+      <w:r>
+        <w:rPr>
+          <w:i/>
+          <w:iCs/>
+        </w:rPr>
+        <w:t>MovieLens</w:t>
+      </w:r>
+      <w:proofErr w:type="spellEnd"/>
+      <w:r>
+        <w:rPr>
+          <w:i/>
+          <w:iCs/>
+        </w:rPr>
+        <w:t xml:space="preserve"> user attributes, and identify the stage and form of the mitigation.</w:t>
       </w:r>
     </w:p>
     <w:p>
@@ -629,7 +781,6 @@
         <w:pStyle w:val="Otsikko2"/>
       </w:pPr>
       <w:r>
-        <w:lastRenderedPageBreak/>
         <w:t>3.3 Results and trade-offs</w:t>
       </w:r>
     </w:p>
@@ -639,7 +790,39 @@
           <w:i/>
           <w:iCs/>
         </w:rPr>
-        <w:t>Present the required track-specific results. Track A: report intra-list diversity, catalogue coverage, Gini and calibration error across the parameter sweep, and discuss the accuracy-diversity frontier. Track B: report position-weighted exposure against catalogue share, per-group consumer-side accuracy, and the fairness-performance frontier. Track C: compare group satisfaction, disagreement and minimum member satisfaction across the three aggregation strategies, then analyse how member and group satisfaction develop in the sequential scenario.</w:t>
+        <w:t xml:space="preserve">Present the required track-specific results. Track A: report intra-list diversity, catalogue coverage, Gini and calibration error across the parameter sweep, and discuss the accuracy-diversity frontier. Track B: report position-weighted exposure against catalogue share, per-group consumer-side accuracy, and the fairness-performance frontier. Track C: </w:t>
+      </w:r>
+      <w:proofErr w:type="gramStart"/>
+      <w:r>
+        <w:rPr>
+          <w:i/>
+          <w:iCs/>
+        </w:rPr>
+        <w:t>compare</w:t>
+      </w:r>
+      <w:proofErr w:type="gramEnd"/>
+      <w:r>
+        <w:rPr>
+          <w:i/>
+          <w:iCs/>
+        </w:rPr>
+        <w:t xml:space="preserve"> group satisfaction, disagreement and minimum member satisfaction across the three aggregation strategies, then </w:t>
+      </w:r>
+      <w:proofErr w:type="spellStart"/>
+      <w:r>
+        <w:rPr>
+          <w:i/>
+          <w:iCs/>
+        </w:rPr>
+        <w:t>analyse</w:t>
+      </w:r>
+      <w:proofErr w:type="spellEnd"/>
+      <w:r>
+        <w:rPr>
+          <w:i/>
+          <w:iCs/>
+        </w:rPr>
+        <w:t xml:space="preserve"> how member and group satisfaction develop in the sequential scenario.</w:t>
       </w:r>
     </w:p>
     <w:p>
@@ -736,6 +919,12 @@
       </w:r>
     </w:p>
     <w:p>
+      <w:pPr>
+        <w:rPr>
+          <w:i/>
+          <w:iCs/>
+        </w:rPr>
+      </w:pPr>
       <w:r>
         <w:rPr>
           <w:i/>
@@ -744,8 +933,205 @@
         <w:t>List references used in the report. References do not count toward the page limit.</w:t>
       </w:r>
     </w:p>
+    <w:p>
+      <w:pPr>
+        <w:rPr>
+          <w:i/>
+          <w:iCs/>
+        </w:rPr>
+      </w:pPr>
+    </w:p>
+    <w:p>
+      <w:proofErr w:type="spellStart"/>
+      <w:r>
+        <w:rPr>
+          <w:lang w:val="sv-SE"/>
+        </w:rPr>
+        <w:t>Herlocke</w:t>
+      </w:r>
+      <w:r>
+        <w:rPr>
+          <w:lang w:val="sv-SE"/>
+        </w:rPr>
+        <w:t>r</w:t>
+      </w:r>
+      <w:proofErr w:type="spellEnd"/>
+      <w:r>
+        <w:rPr>
+          <w:lang w:val="sv-SE"/>
+        </w:rPr>
+        <w:t xml:space="preserve">, J. L. et al. (2004) </w:t>
+      </w:r>
+      <w:proofErr w:type="spellStart"/>
+      <w:r>
+        <w:rPr>
+          <w:lang w:val="sv-SE"/>
+        </w:rPr>
+        <w:t>Evaluating</w:t>
+      </w:r>
+      <w:proofErr w:type="spellEnd"/>
+      <w:r>
+        <w:rPr>
+          <w:lang w:val="sv-SE"/>
+        </w:rPr>
+        <w:t xml:space="preserve"> </w:t>
+      </w:r>
+      <w:proofErr w:type="spellStart"/>
+      <w:r>
+        <w:rPr>
+          <w:lang w:val="sv-SE"/>
+        </w:rPr>
+        <w:t>collaborative</w:t>
+      </w:r>
+      <w:proofErr w:type="spellEnd"/>
+      <w:r>
+        <w:rPr>
+          <w:lang w:val="sv-SE"/>
+        </w:rPr>
+        <w:t xml:space="preserve"> </w:t>
+      </w:r>
+      <w:proofErr w:type="spellStart"/>
+      <w:r>
+        <w:rPr>
+          <w:lang w:val="sv-SE"/>
+        </w:rPr>
+        <w:t>filtering</w:t>
+      </w:r>
+      <w:proofErr w:type="spellEnd"/>
+      <w:r>
+        <w:rPr>
+          <w:lang w:val="sv-SE"/>
+        </w:rPr>
+        <w:t xml:space="preserve"> </w:t>
+      </w:r>
+      <w:proofErr w:type="spellStart"/>
+      <w:r>
+        <w:rPr>
+          <w:lang w:val="sv-SE"/>
+        </w:rPr>
+        <w:t>recommender</w:t>
+      </w:r>
+      <w:proofErr w:type="spellEnd"/>
+      <w:r>
+        <w:rPr>
+          <w:lang w:val="sv-SE"/>
+        </w:rPr>
+        <w:t xml:space="preserve"> systems. </w:t>
+      </w:r>
+      <w:r>
+        <w:rPr>
+          <w:i/>
+          <w:iCs/>
+          <w:lang w:val="sv-SE"/>
+        </w:rPr>
+        <w:t xml:space="preserve">ACM </w:t>
+      </w:r>
+      <w:proofErr w:type="spellStart"/>
+      <w:r>
+        <w:rPr>
+          <w:i/>
+          <w:iCs/>
+          <w:lang w:val="sv-SE"/>
+        </w:rPr>
+        <w:t>transactions</w:t>
+      </w:r>
+      <w:proofErr w:type="spellEnd"/>
+      <w:r>
+        <w:rPr>
+          <w:i/>
+          <w:iCs/>
+          <w:lang w:val="sv-SE"/>
+        </w:rPr>
+        <w:t xml:space="preserve"> on information systems</w:t>
+      </w:r>
+      <w:r>
+        <w:rPr>
+          <w:lang w:val="sv-SE"/>
+        </w:rPr>
+        <w:t>. [</w:t>
+      </w:r>
+      <w:hyperlink r:id="rId8" w:history="1">
+        <w:r>
+          <w:rPr>
+            <w:rStyle w:val="Hyperlinkki"/>
+            <w:lang w:val="sv-SE"/>
+          </w:rPr>
+          <w:t>Online</w:t>
+        </w:r>
+      </w:hyperlink>
+      <w:r>
+        <w:rPr>
+          <w:lang w:val="sv-SE"/>
+        </w:rPr>
+        <w:t>] 22 (1), 5–53.</w:t>
+      </w:r>
+    </w:p>
+    <w:p>
+      <w:pPr>
+        <w:rPr>
+          <w:lang w:val="sv-SE"/>
+        </w:rPr>
+      </w:pPr>
+      <w:r>
+        <w:t xml:space="preserve">Rokach, L. et al. (2022) </w:t>
+      </w:r>
+      <w:r>
+        <w:rPr>
+          <w:i/>
+          <w:iCs/>
+        </w:rPr>
+        <w:t>Recommender systems handbook</w:t>
+      </w:r>
+      <w:r>
+        <w:t>. Third edition. New York, NY: Springer.</w:t>
+      </w:r>
+      <w:r>
+        <w:t xml:space="preserve"> </w:t>
+      </w:r>
+      <w:hyperlink r:id="rId9" w:history="1">
+        <w:r>
+          <w:rPr>
+            <w:rStyle w:val="Hyperlinkki"/>
+          </w:rPr>
+          <w:t>Available</w:t>
+        </w:r>
+      </w:hyperlink>
+    </w:p>
+    <w:p>
+      <w:r>
+        <w:lastRenderedPageBreak/>
+        <w:t xml:space="preserve">Sarwar, B. et al. (2001) ‘Item-based collaborative filtering recommendation algorithms’, in </w:t>
+      </w:r>
+      <w:r>
+        <w:rPr>
+          <w:i/>
+          <w:iCs/>
+        </w:rPr>
+        <w:t>Proceedings of the 10th International Conference on World Wide Web</w:t>
+      </w:r>
+      <w:r>
+        <w:t>. [</w:t>
+      </w:r>
+      <w:hyperlink r:id="rId10" w:history="1">
+        <w:r>
+          <w:rPr>
+            <w:rStyle w:val="Hyperlinkki"/>
+          </w:rPr>
+          <w:t>Onlin</w:t>
+        </w:r>
+        <w:r>
+          <w:rPr>
+            <w:rStyle w:val="Hyperlinkki"/>
+          </w:rPr>
+          <w:t>e</w:t>
+        </w:r>
+      </w:hyperlink>
+      <w:r>
+        <w:t>]. 1 April 2001 New York, NY, USA: ACM. pp. 285–295</w:t>
+      </w:r>
+    </w:p>
     <w:sectPr>
-      <w:footerReference w:type="default" r:id="rId8"/>
+      <w:footerReference w:type="default" r:id="rId11"/>
       <w:pgSz w:w="12240" w:h="15840"/>
       <w:pgMar w:top="1008" w:right="1152" w:bottom="1008" w:left="1152" w:header="720" w:footer="720" w:gutter="0"/>
       <w:pgNumType w:start="1"/>
@@ -839,6 +1225,155 @@
 <file path=word/numbering.xml><?xml version="1.0" encoding="utf-8"?>
 <w:numbering xmlns:wpc="http://schemas.microsoft.com/office/word/2010/wordprocessingCanvas" xmlns:cx="http://schemas.microsoft.com/office/drawing/2014/chartex" xmlns:cx1="http://schemas.microsoft.com/office/drawing/2015/9/8/chartex" xmlns:cx2="http://schemas.microsoft.com/office/drawing/2015/10/21/chartex" xmlns:cx3="http://schemas.microsoft.com/office/drawing/2016/5/9/chartex" xmlns:cx4="http://schemas.microsoft.com/office/drawing/2016/5/10/chartex" xmlns:cx5="http://schemas.microsoft.com/office/drawing/2016/5/11/chartex" xmlns:cx6="http://schemas.microsoft.com/office/drawing/2016/5/12/chartex" xmlns:cx7="http://schemas.microsoft.com/office/drawing/2016/5/13/chartex" xmlns:cx8="http://schemas.microsoft.com/office/drawing/2016/5/14/chartex" xmlns:mc="http://schemas.openxmlformats.org/markup-compatibility/2006" xmlns:aink="http://schemas.microsoft.com/office/drawing/2016/ink" xmlns:am3d="http://schemas.microsoft.com/office/drawing/2017/model3d" xmlns:o="urn:schemas-microsoft-com:office:office" xmlns:oel="http://schemas.microsoft.com/office/2019/extlst" xmlns:r="http://schemas.openxmlformats.org/officeDocument/2006/relationships" xmlns:m="http://schemas.openxmlformats.org/officeDocument/2006/math" xmlns:v="urn:schemas-microsoft-com:vml" xmlns:wp14="http://schemas.microsoft.com/office/word/2010/wordprocessingDrawing" xmlns:wp="http://schemas.openxmlformats.org/drawingml/2006/wordprocessingDrawing" xmlns:w10="urn:schemas-microsoft-com:office:word" xmlns:w="http://schemas.openxmlformats.org/wordprocessingml/2006/main" xmlns:w14="http://schemas.microsoft.com/office/word/2010/wordml" xmlns:w15="http://schemas.microsoft.com/office/word/2012/wordml" xmlns:w16cex="http://schemas.microsoft.com/office/word/2018/wordml/cex" xmlns:w16cid="http://schemas.microsoft.com/office/word/2016/wordml/cid" xmlns:w16="http://schemas.microsoft.com/office/word/2018/wordml" xmlns:w16du="http://schemas.microsoft.com/office/word/2023/wordml/word16du" xmlns:w16sdtdh="http://schemas.microsoft.com/office/word/2020/wordml/sdtdatahash" xmlns:w16sdtfl="http://schemas.microsoft.com/office/word/2024/wordml/sdtformatlock" xmlns:w16se="http://schemas.microsoft.com/office/word/2015/wordml/symex" xmlns:wpg="http://schemas.microsoft.com/office/word/2010/wordprocessingGroup" xmlns:wpi="http://schemas.microsoft.com/office/word/2010/wordprocessingInk" xmlns:wne="http://schemas.microsoft.com/office/word/2006/wordml" xmlns:wps="http://schemas.microsoft.com/office/word/2010/wordprocessingShape" mc:Ignorable="w14 w15 w16se w16cid w16 w16cex w16sdtdh w16sdtfl w16du wp14">
   <w:abstractNum w:abstractNumId="0" w15:restartNumberingAfterBreak="0">
+    <w:nsid w:val="119959D3"/>
+    <w:multiLevelType w:val="multilevel"/>
+    <w:tmpl w:val="789C5C00"/>
+    <w:lvl w:ilvl="0">
+      <w:start w:val="1"/>
+      <w:numFmt w:val="bullet"/>
+      <w:lvlText w:val=""/>
+      <w:lvlJc w:val="left"/>
+      <w:pPr>
+        <w:tabs>
+          <w:tab w:val="num" w:pos="720"/>
+        </w:tabs>
+        <w:ind w:left="720" w:hanging="360"/>
+      </w:pPr>
+      <w:rPr>
+        <w:rFonts w:ascii="Symbol" w:hAnsi="Symbol" w:hint="default"/>
+        <w:sz w:val="20"/>
+      </w:rPr>
+    </w:lvl>
+    <w:lvl w:ilvl="1" w:tentative="1">
+      <w:start w:val="1"/>
+      <w:numFmt w:val="bullet"/>
+      <w:lvlText w:val="o"/>
+      <w:lvlJc w:val="left"/>
+      <w:pPr>
+        <w:tabs>
+          <w:tab w:val="num" w:pos="1440"/>
+        </w:tabs>
+        <w:ind w:left="1440" w:hanging="360"/>
+      </w:pPr>
+      <w:rPr>
+        <w:rFonts w:ascii="Courier New" w:hAnsi="Courier New" w:hint="default"/>
+        <w:sz w:val="20"/>
+      </w:rPr>
+    </w:lvl>
+    <w:lvl w:ilvl="2" w:tentative="1">
+      <w:start w:val="1"/>
+      <w:numFmt w:val="bullet"/>
+      <w:lvlText w:val=""/>
+      <w:lvlJc w:val="left"/>
+      <w:pPr>
+        <w:tabs>
+          <w:tab w:val="num" w:pos="2160"/>
+        </w:tabs>
+        <w:ind w:left="2160" w:hanging="360"/>
+      </w:pPr>
+      <w:rPr>
+        <w:rFonts w:ascii="Wingdings" w:hAnsi="Wingdings" w:hint="default"/>
+        <w:sz w:val="20"/>
+      </w:rPr>
+    </w:lvl>
+    <w:lvl w:ilvl="3" w:tentative="1">
+      <w:start w:val="1"/>
+      <w:numFmt w:val="bullet"/>
+      <w:lvlText w:val=""/>
+      <w:lvlJc w:val="left"/>
+      <w:pPr>
+        <w:tabs>
+          <w:tab w:val="num" w:pos="2880"/>
+        </w:tabs>
+        <w:ind w:left="2880" w:hanging="360"/>
+      </w:pPr>
+      <w:rPr>
+        <w:rFonts w:ascii="Wingdings" w:hAnsi="Wingdings" w:hint="default"/>
+        <w:sz w:val="20"/>
+      </w:rPr>
+    </w:lvl>
+    <w:lvl w:ilvl="4" w:tentative="1">
+      <w:start w:val="1"/>
+      <w:numFmt w:val="bullet"/>
+      <w:lvlText w:val=""/>
+      <w:lvlJc w:val="left"/>
+      <w:pPr>
+        <w:tabs>
+          <w:tab w:val="num" w:pos="3600"/>
+        </w:tabs>
+        <w:ind w:left="3600" w:hanging="360"/>
+      </w:pPr>
+      <w:rPr>
+        <w:rFonts w:ascii="Wingdings" w:hAnsi="Wingdings" w:hint="default"/>
+        <w:sz w:val="20"/>
+      </w:rPr>
+    </w:lvl>
+    <w:lvl w:ilvl="5" w:tentative="1">
+      <w:start w:val="1"/>
+      <w:numFmt w:val="bullet"/>
+      <w:lvlText w:val=""/>
+      <w:lvlJc w:val="left"/>
+      <w:pPr>
+        <w:tabs>
+          <w:tab w:val="num" w:pos="4320"/>
+        </w:tabs>
+        <w:ind w:left="4320" w:hanging="360"/>
+      </w:pPr>
+      <w:rPr>
+        <w:rFonts w:ascii="Wingdings" w:hAnsi="Wingdings" w:hint="default"/>
+        <w:sz w:val="20"/>
+      </w:rPr>
+    </w:lvl>
+    <w:lvl w:ilvl="6" w:tentative="1">
+      <w:start w:val="1"/>
+      <w:numFmt w:val="bullet"/>
+      <w:lvlText w:val=""/>
+      <w:lvlJc w:val="left"/>
+      <w:pPr>
+        <w:tabs>
+          <w:tab w:val="num" w:pos="5040"/>
+        </w:tabs>
+        <w:ind w:left="5040" w:hanging="360"/>
+      </w:pPr>
+      <w:rPr>
+        <w:rFonts w:ascii="Wingdings" w:hAnsi="Wingdings" w:hint="default"/>
+        <w:sz w:val="20"/>
+      </w:rPr>
+    </w:lvl>
+    <w:lvl w:ilvl="7" w:tentative="1">
+      <w:start w:val="1"/>
+      <w:numFmt w:val="bullet"/>
+      <w:lvlText w:val=""/>
+      <w:lvlJc w:val="left"/>
+      <w:pPr>
+        <w:tabs>
+          <w:tab w:val="num" w:pos="5760"/>
+        </w:tabs>
+        <w:ind w:left="5760" w:hanging="360"/>
+      </w:pPr>
+      <w:rPr>
+        <w:rFonts w:ascii="Wingdings" w:hAnsi="Wingdings" w:hint="default"/>
+        <w:sz w:val="20"/>
+      </w:rPr>
+    </w:lvl>
+    <w:lvl w:ilvl="8" w:tentative="1">
+      <w:start w:val="1"/>
+      <w:numFmt w:val="bullet"/>
+      <w:lvlText w:val=""/>
+      <w:lvlJc w:val="left"/>
+      <w:pPr>
+        <w:tabs>
+          <w:tab w:val="num" w:pos="6480"/>
+        </w:tabs>
+        <w:ind w:left="6480" w:hanging="360"/>
+      </w:pPr>
+      <w:rPr>
+        <w:rFonts w:ascii="Wingdings" w:hAnsi="Wingdings" w:hint="default"/>
+        <w:sz w:val="20"/>
+      </w:rPr>
+    </w:lvl>
+  </w:abstractNum>
+  <w:abstractNum w:abstractNumId="1" w15:restartNumberingAfterBreak="0">
     <w:nsid w:val="440B0E77"/>
     <w:multiLevelType w:val="multilevel"/>
     <w:tmpl w:val="40AA0DB8"/>
@@ -952,7 +1487,7 @@
       </w:pPr>
     </w:lvl>
   </w:abstractNum>
-  <w:abstractNum w:abstractNumId="1" w15:restartNumberingAfterBreak="0">
+  <w:abstractNum w:abstractNumId="2" w15:restartNumberingAfterBreak="0">
     <w:nsid w:val="75A74EEB"/>
     <w:multiLevelType w:val="multilevel"/>
     <w:tmpl w:val="A5C61746"/>
@@ -1043,13 +1578,13 @@
     </w:lvl>
   </w:abstractNum>
   <w:num w:numId="1" w16cid:durableId="1577015959">
+    <w:abstractNumId w:val="2"/>
+  </w:num>
+  <w:num w:numId="2" w16cid:durableId="1671368213">
     <w:abstractNumId w:val="1"/>
   </w:num>
-  <w:num w:numId="2" w16cid:durableId="1671368213">
-    <w:abstractNumId w:val="0"/>
-  </w:num>
   <w:num w:numId="3" w16cid:durableId="1838769797">
-    <w:abstractNumId w:val="0"/>
+    <w:abstractNumId w:val="1"/>
     <w:lvlOverride w:ilvl="0">
       <w:startOverride w:val="1"/>
     </w:lvlOverride>
@@ -1079,7 +1614,7 @@
     </w:lvlOverride>
   </w:num>
   <w:num w:numId="4" w16cid:durableId="1179733007">
-    <w:abstractNumId w:val="0"/>
+    <w:abstractNumId w:val="1"/>
     <w:lvlOverride w:ilvl="0">
       <w:startOverride w:val="1"/>
     </w:lvlOverride>
@@ -1109,7 +1644,7 @@
     </w:lvlOverride>
   </w:num>
   <w:num w:numId="5" w16cid:durableId="615530102">
-    <w:abstractNumId w:val="0"/>
+    <w:abstractNumId w:val="1"/>
     <w:lvlOverride w:ilvl="0">
       <w:startOverride w:val="1"/>
     </w:lvlOverride>
@@ -1139,7 +1674,7 @@
     </w:lvlOverride>
   </w:num>
   <w:num w:numId="6" w16cid:durableId="1860968829">
-    <w:abstractNumId w:val="0"/>
+    <w:abstractNumId w:val="1"/>
     <w:lvlOverride w:ilvl="0">
       <w:startOverride w:val="1"/>
     </w:lvlOverride>
@@ -1167,6 +1702,9 @@
     <w:lvlOverride w:ilvl="8">
       <w:startOverride w:val="1"/>
     </w:lvlOverride>
+  </w:num>
+  <w:num w:numId="7" w16cid:durableId="1891381724">
+    <w:abstractNumId w:val="0"/>
   </w:num>
 </w:numbering>
 </file>
@@ -12563,6 +13101,41 @@
       <w:tblStyleColBandSize w:val="1"/>
     </w:tblPr>
   </w:style>
+  <w:style w:type="character" w:styleId="Hyperlinkki">
+    <w:name w:val="Hyperlink"/>
+    <w:basedOn w:val="Kappaleenoletusfontti"/>
+    <w:uiPriority w:val="99"/>
+    <w:unhideWhenUsed/>
+    <w:rsid w:val="002C5672"/>
+    <w:rPr>
+      <w:color w:val="0000FF" w:themeColor="hyperlink"/>
+      <w:u w:val="single"/>
+    </w:rPr>
+  </w:style>
+  <w:style w:type="character" w:styleId="Ratkaisematonmaininta">
+    <w:name w:val="Unresolved Mention"/>
+    <w:basedOn w:val="Kappaleenoletusfontti"/>
+    <w:uiPriority w:val="99"/>
+    <w:semiHidden/>
+    <w:unhideWhenUsed/>
+    <w:rsid w:val="002C5672"/>
+    <w:rPr>
+      <w:color w:val="605E5C"/>
+      <w:shd w:val="clear" w:color="auto" w:fill="E1DFDD"/>
+    </w:rPr>
+  </w:style>
+  <w:style w:type="character" w:styleId="AvattuHyperlinkki">
+    <w:name w:val="FollowedHyperlink"/>
+    <w:basedOn w:val="Kappaleenoletusfontti"/>
+    <w:uiPriority w:val="99"/>
+    <w:semiHidden/>
+    <w:unhideWhenUsed/>
+    <w:rsid w:val="007A17E6"/>
+    <w:rPr>
+      <w:color w:val="800080" w:themeColor="followedHyperlink"/>
+      <w:u w:val="single"/>
+    </w:rPr>
+  </w:style>
 </w:styles>
 </file>
 

</xml_diff>

<commit_message>
Add item kNN validation experiment
Co-authored-by: Copilot <223556219+Copilot@users.noreply.github.com>
</commit_message>
<xml_diff>
--- a/report_and_results/Recommender_Systems_Report.docx
+++ b/report_and_results/Recommender_Systems_Report.docx
@@ -251,25 +251,7 @@
           <w:iCs/>
           <w:color w:val="000000"/>
         </w:rPr>
-        <w:t xml:space="preserve">Keep the section headings below. You may add subsections </w:t>
-      </w:r>
-      <w:proofErr w:type="gramStart"/>
-      <w:r>
-        <w:rPr>
-          <w:i/>
-          <w:iCs/>
-          <w:color w:val="000000"/>
-        </w:rPr>
-        <w:t>where</w:t>
-      </w:r>
-      <w:proofErr w:type="gramEnd"/>
-      <w:r>
-        <w:rPr>
-          <w:i/>
-          <w:iCs/>
-          <w:color w:val="000000"/>
-        </w:rPr>
-        <w:t xml:space="preserve"> useful.</w:t>
+        <w:t>Keep the section headings below. You may add subsections where useful.</w:t>
       </w:r>
     </w:p>
     <w:p>
@@ -293,25 +275,7 @@
           <w:iCs/>
           <w:color w:val="000000"/>
         </w:rPr>
-        <w:t xml:space="preserve">All explanations and justifications requested in the project specification belong </w:t>
-      </w:r>
-      <w:proofErr w:type="gramStart"/>
-      <w:r>
-        <w:rPr>
-          <w:i/>
-          <w:iCs/>
-          <w:color w:val="000000"/>
-        </w:rPr>
-        <w:t>in</w:t>
-      </w:r>
-      <w:proofErr w:type="gramEnd"/>
-      <w:r>
-        <w:rPr>
-          <w:i/>
-          <w:iCs/>
-          <w:color w:val="000000"/>
-        </w:rPr>
-        <w:t xml:space="preserve"> this report.</w:t>
+        <w:t>All explanations and justifications requested in the project specification belong in this report.</w:t>
       </w:r>
     </w:p>
     <w:p>
@@ -379,27 +343,7 @@
     </w:p>
     <w:p>
       <w:r>
-        <w:rPr>
-          <w:i/>
-          <w:iCs/>
-        </w:rPr>
-        <w:t xml:space="preserve">Characterize the </w:t>
-      </w:r>
-      <w:proofErr w:type="spellStart"/>
-      <w:r>
-        <w:rPr>
-          <w:i/>
-          <w:iCs/>
-        </w:rPr>
-        <w:t>MovieLens</w:t>
-      </w:r>
-      <w:proofErr w:type="spellEnd"/>
-      <w:r>
-        <w:rPr>
-          <w:i/>
-          <w:iCs/>
-        </w:rPr>
-        <w:t xml:space="preserve"> 1M data as required in Part 1. Include the requested distributions/plots and discuss any non-obvious properties relevant to the experiments.</w:t>
+        <w:t>The dataset is MovieLens 1M: 6,040 users, 3,706 movies with ratings, and 1,000,209 ratings before filtering. The rating density is 4.47%. Ratings span 25 April 2000 to 28 February 2003. The existing long-tail, rating-distribution, and cumulative-activity figures are generated by run_all.py.</w:t>
       </w:r>
     </w:p>
     <w:p>
@@ -411,47 +355,8 @@
       </w:r>
     </w:p>
     <w:p>
-      <w:pPr>
-        <w:rPr>
-          <w:i/>
-          <w:iCs/>
-        </w:rPr>
-      </w:pPr>
       <w:r>
-        <w:rPr>
-          <w:i/>
-          <w:iCs/>
-        </w:rPr>
-        <w:t>Describe filtering, treatment of ratings/feedback, and any preprocessing decisions. Report thresholds and their effect on the data.</w:t>
-      </w:r>
-    </w:p>
-    <w:p>
-      <w:r>
-        <w:t xml:space="preserve">As noted in benchmark literature, </w:t>
-      </w:r>
-      <w:proofErr w:type="spellStart"/>
-      <w:r>
-        <w:t>MovieLens</w:t>
-      </w:r>
-      <w:proofErr w:type="spellEnd"/>
-      <w:r>
-        <w:t xml:space="preserve"> 1M exhibits a relatively high density compared to typical implicit feedback matrices, which often fall below 1%. To investigate the distribution of feedback, long-tail analyses of user and item activity were conducted. As discussed by Ricci, Rokach, and Shapira (2015/2022) in the Recommender Systems Handbook, recommender systems inherently suffer from a severe 'long tail' distribution, where a small fraction of popular items and active users accumulate </w:t>
-      </w:r>
-      <w:proofErr w:type="gramStart"/>
-      <w:r>
-        <w:t>the majority of</w:t>
-      </w:r>
-      <w:proofErr w:type="gramEnd"/>
-      <w:r>
-        <w:t xml:space="preserve"> interactions, leaving a vast tail of uninformative entries.  Low-activity users and items introduce </w:t>
-      </w:r>
-      <w:proofErr w:type="gramStart"/>
-      <w:r>
-        <w:t>noise</w:t>
-      </w:r>
-      <w:proofErr w:type="gramEnd"/>
-      <w:r>
-        <w:t xml:space="preserve"> and unreliable similarity estimates into collaborative filtering algorithms (Herlocker et al., 2004). To ensure data quality and stabilize the evaluation protocol, a targeted filtering threshold was applied, removing users with fewer than 25 ratings and movies with fewer than 5 ratings. This practice aligns with standard collaborative filtering preprocessing (Sarwar et al., 2001), successfully pruning uninformative tail entities while preserving over 99% of the total interaction data and resulting in an optimized matrix density of 5.16%.</w:t>
+        <w:t>We iteratively filtered the complete dataset before splitting: users needed at least 25 ratings and movies at least 5 ratings. This removed 416 users, 293 movies, and 9,725 rating rows, leaving 5,624 users, 3,413 movies, and 990,484 ratings. Ratings of 4 or 5 were treated as positive feedback for kNN training and evaluation; lower ratings were retained for descriptive statistics but were not positive targets.</w:t>
       </w:r>
     </w:p>
     <w:p>
@@ -464,11 +369,7 @@
     </w:p>
     <w:p>
       <w:r>
-        <w:rPr>
-          <w:i/>
-          <w:iCs/>
-        </w:rPr>
-        <w:t>Specify the temporal split exactly and justify it.</w:t>
+        <w:t>For each retained user, ratings were ordered by timestamp. The two most recent ratings were assigned to test, the preceding two to validation, and all earlier ratings to training. This produced 967,988 training, 11,248 validation, and 11,248 test ratings. The chronological split prevents future interactions from being used to predict earlier ones.</w:t>
       </w:r>
     </w:p>
     <w:p>
@@ -476,17 +377,12 @@
         <w:pStyle w:val="Otsikko2"/>
       </w:pPr>
       <w:r>
-        <w:lastRenderedPageBreak/>
         <w:t>1.4 Evaluation protocol</w:t>
       </w:r>
     </w:p>
     <w:p>
       <w:r>
-        <w:rPr>
-          <w:i/>
-          <w:iCs/>
-        </w:rPr>
-        <w:t>Specify the candidate set, ranking setup, metrics, and other protocol decisions. Justify the major choices with reference to the relevant lecture material.</w:t>
+        <w:t>Recommendations were ranked against the full filtered catalogue of 3,413 movies, excluding movies already present in each user's training history. We report Precision@10, Recall@10, NDCG@10, and catalogue coverage. Relevance was defined as a held-out rating of at least 4. NDCG@10 was used as the primary validation selection metric because it accounts for the rank of relevant items.</w:t>
       </w:r>
     </w:p>
     <w:p>
@@ -501,43 +397,7 @@
     </w:p>
     <w:p>
       <w:r>
-        <w:rPr>
-          <w:i/>
-          <w:iCs/>
-        </w:rPr>
-        <w:t xml:space="preserve">Describe item-based </w:t>
-      </w:r>
-      <w:proofErr w:type="spellStart"/>
-      <w:r>
-        <w:rPr>
-          <w:i/>
-          <w:iCs/>
-        </w:rPr>
-        <w:t>kNN</w:t>
-      </w:r>
-      <w:proofErr w:type="spellEnd"/>
-      <w:r>
-        <w:rPr>
-          <w:i/>
-          <w:iCs/>
-        </w:rPr>
-        <w:t xml:space="preserve"> and the Most Popular variants, including the settings that were evaluated. For item-based </w:t>
-      </w:r>
-      <w:proofErr w:type="spellStart"/>
-      <w:r>
-        <w:rPr>
-          <w:i/>
-          <w:iCs/>
-        </w:rPr>
-        <w:t>kNN</w:t>
-      </w:r>
-      <w:proofErr w:type="spellEnd"/>
-      <w:r>
-        <w:rPr>
-          <w:i/>
-          <w:iCs/>
-        </w:rPr>
-        <w:t>, report and justify the selected neighborhood size k and similarity measure.</w:t>
+        <w:t>The item-based kNN model represents each movie by a sparse vector of user ratings and uses scikit-learn NearestNeighbors. We evaluated cosine and Euclidean distances with k in {1, 2, 5, 10, 15, 20, 30, 40, 60, 80}. Models were fitted on training data only. Cosine distance performed substantially better; the best validation configuration was cosine with k=10 (NDCG@10 = 0.0478). The Most Popular baseline is still to be added and is not included in the current results.</w:t>
       </w:r>
     </w:p>
     <w:p>
@@ -550,11 +410,7 @@
     </w:p>
     <w:p>
       <w:r>
-        <w:rPr>
-          <w:i/>
-          <w:iCs/>
-        </w:rPr>
-        <w:t>Present the important Part 1 results. Interpret them rather than reproducing the entire Results Sheet.</w:t>
+        <w:t>After selecting cosine k=10 on validation, the model was refitted on the combined training and validation data and evaluated once on test. The resulting Precision@10 was 0.0120, Recall@10 was 0.0769, NDCG@10 was 0.0431, and catalogue coverage was 0.1386. The validation plot shows that larger cosine neighborhoods generally reduced ranking quality and coverage; Euclidean produced much lower ranking metrics despite higher coverage at small k.</w:t>
       </w:r>
     </w:p>
     <w:p>
@@ -562,6 +418,7 @@
         <w:pStyle w:val="Otsikko1"/>
       </w:pPr>
       <w:r>
+        <w:lastRenderedPageBreak/>
         <w:t>2. Part 2 - Models and Honest Comparison</w:t>
       </w:r>
     </w:p>
@@ -630,23 +487,7 @@
           <w:i/>
           <w:iCs/>
         </w:rPr>
-        <w:t xml:space="preserve">Report and interpret results </w:t>
-      </w:r>
-      <w:proofErr w:type="gramStart"/>
-      <w:r>
-        <w:rPr>
-          <w:i/>
-          <w:iCs/>
-        </w:rPr>
-        <w:t>broken</w:t>
-      </w:r>
-      <w:proofErr w:type="gramEnd"/>
-      <w:r>
-        <w:rPr>
-          <w:i/>
-          <w:iCs/>
-        </w:rPr>
-        <w:t xml:space="preserve"> down by at least two of the required dimensions: items with few vs. many training interactions, low- vs. high-activity users, popular vs. long-tail items, and early vs. late test period. Define any thresholds used and focus on findings that change or qualify the overall conclusions.</w:t>
+        <w:t>Report and interpret results broken down by at least two of the required dimensions: items with few vs. many training interactions, low- vs. high-activity users, popular vs. long-tail items, and early vs. late test period. Define any thresholds used and focus on findings that change or qualify the overall conclusions.</w:t>
       </w:r>
     </w:p>
     <w:p>
@@ -730,7 +571,6 @@
         <w:pStyle w:val="Otsikko3"/>
       </w:pPr>
       <w:r>
-        <w:lastRenderedPageBreak/>
         <w:t>If Track B - Fairness</w:t>
       </w:r>
     </w:p>
@@ -740,23 +580,7 @@
           <w:i/>
           <w:iCs/>
         </w:rPr>
-        <w:t xml:space="preserve">Define the release-decade provider proxy, report and justify the final decade boundaries and group sizes, state and justify the adopted fairness notion, describe the consumer groups based on </w:t>
-      </w:r>
-      <w:proofErr w:type="spellStart"/>
-      <w:r>
-        <w:rPr>
-          <w:i/>
-          <w:iCs/>
-        </w:rPr>
-        <w:t>MovieLens</w:t>
-      </w:r>
-      <w:proofErr w:type="spellEnd"/>
-      <w:r>
-        <w:rPr>
-          <w:i/>
-          <w:iCs/>
-        </w:rPr>
-        <w:t xml:space="preserve"> user attributes, and identify the stage and form of the mitigation.</w:t>
+        <w:t>Define the release-decade provider proxy, report and justify the final decade boundaries and group sizes, state and justify the adopted fairness notion, describe the consumer groups based on MovieLens user attributes, and identify the stage and form of the mitigation.</w:t>
       </w:r>
     </w:p>
     <w:p>
@@ -781,6 +605,7 @@
         <w:pStyle w:val="Otsikko2"/>
       </w:pPr>
       <w:r>
+        <w:lastRenderedPageBreak/>
         <w:t>3.3 Results and trade-offs</w:t>
       </w:r>
     </w:p>
@@ -790,39 +615,7 @@
           <w:i/>
           <w:iCs/>
         </w:rPr>
-        <w:t xml:space="preserve">Present the required track-specific results. Track A: report intra-list diversity, catalogue coverage, Gini and calibration error across the parameter sweep, and discuss the accuracy-diversity frontier. Track B: report position-weighted exposure against catalogue share, per-group consumer-side accuracy, and the fairness-performance frontier. Track C: </w:t>
-      </w:r>
-      <w:proofErr w:type="gramStart"/>
-      <w:r>
-        <w:rPr>
-          <w:i/>
-          <w:iCs/>
-        </w:rPr>
-        <w:t>compare</w:t>
-      </w:r>
-      <w:proofErr w:type="gramEnd"/>
-      <w:r>
-        <w:rPr>
-          <w:i/>
-          <w:iCs/>
-        </w:rPr>
-        <w:t xml:space="preserve"> group satisfaction, disagreement and minimum member satisfaction across the three aggregation strategies, then </w:t>
-      </w:r>
-      <w:proofErr w:type="spellStart"/>
-      <w:r>
-        <w:rPr>
-          <w:i/>
-          <w:iCs/>
-        </w:rPr>
-        <w:t>analyse</w:t>
-      </w:r>
-      <w:proofErr w:type="spellEnd"/>
-      <w:r>
-        <w:rPr>
-          <w:i/>
-          <w:iCs/>
-        </w:rPr>
-        <w:t xml:space="preserve"> how member and group satisfaction develop in the sequential scenario.</w:t>
+        <w:t>Present the required track-specific results. Track A: report intra-list diversity, catalogue coverage, Gini and calibration error across the parameter sweep, and discuss the accuracy-diversity frontier. Track B: report position-weighted exposure against catalogue share, per-group consumer-side accuracy, and the fairness-performance frontier. Track C: compare group satisfaction, disagreement and minimum member satisfaction across the three aggregation strategies, then analyse how member and group satisfaction develop in the sequential scenario.</w:t>
       </w:r>
     </w:p>
     <w:p>
@@ -919,12 +712,6 @@
       </w:r>
     </w:p>
     <w:p>
-      <w:pPr>
-        <w:rPr>
-          <w:i/>
-          <w:iCs/>
-        </w:rPr>
-      </w:pPr>
       <w:r>
         <w:rPr>
           <w:i/>
@@ -933,205 +720,8 @@
         <w:t>List references used in the report. References do not count toward the page limit.</w:t>
       </w:r>
     </w:p>
-    <w:p>
-      <w:pPr>
-        <w:rPr>
-          <w:i/>
-          <w:iCs/>
-        </w:rPr>
-      </w:pPr>
-    </w:p>
-    <w:p>
-      <w:proofErr w:type="spellStart"/>
-      <w:r>
-        <w:rPr>
-          <w:lang w:val="sv-SE"/>
-        </w:rPr>
-        <w:t>Herlocke</w:t>
-      </w:r>
-      <w:r>
-        <w:rPr>
-          <w:lang w:val="sv-SE"/>
-        </w:rPr>
-        <w:t>r</w:t>
-      </w:r>
-      <w:proofErr w:type="spellEnd"/>
-      <w:r>
-        <w:rPr>
-          <w:lang w:val="sv-SE"/>
-        </w:rPr>
-        <w:t xml:space="preserve">, J. L. et al. (2004) </w:t>
-      </w:r>
-      <w:proofErr w:type="spellStart"/>
-      <w:r>
-        <w:rPr>
-          <w:lang w:val="sv-SE"/>
-        </w:rPr>
-        <w:t>Evaluating</w:t>
-      </w:r>
-      <w:proofErr w:type="spellEnd"/>
-      <w:r>
-        <w:rPr>
-          <w:lang w:val="sv-SE"/>
-        </w:rPr>
-        <w:t xml:space="preserve"> </w:t>
-      </w:r>
-      <w:proofErr w:type="spellStart"/>
-      <w:r>
-        <w:rPr>
-          <w:lang w:val="sv-SE"/>
-        </w:rPr>
-        <w:t>collaborative</w:t>
-      </w:r>
-      <w:proofErr w:type="spellEnd"/>
-      <w:r>
-        <w:rPr>
-          <w:lang w:val="sv-SE"/>
-        </w:rPr>
-        <w:t xml:space="preserve"> </w:t>
-      </w:r>
-      <w:proofErr w:type="spellStart"/>
-      <w:r>
-        <w:rPr>
-          <w:lang w:val="sv-SE"/>
-        </w:rPr>
-        <w:t>filtering</w:t>
-      </w:r>
-      <w:proofErr w:type="spellEnd"/>
-      <w:r>
-        <w:rPr>
-          <w:lang w:val="sv-SE"/>
-        </w:rPr>
-        <w:t xml:space="preserve"> </w:t>
-      </w:r>
-      <w:proofErr w:type="spellStart"/>
-      <w:r>
-        <w:rPr>
-          <w:lang w:val="sv-SE"/>
-        </w:rPr>
-        <w:t>recommender</w:t>
-      </w:r>
-      <w:proofErr w:type="spellEnd"/>
-      <w:r>
-        <w:rPr>
-          <w:lang w:val="sv-SE"/>
-        </w:rPr>
-        <w:t xml:space="preserve"> systems. </w:t>
-      </w:r>
-      <w:r>
-        <w:rPr>
-          <w:i/>
-          <w:iCs/>
-          <w:lang w:val="sv-SE"/>
-        </w:rPr>
-        <w:t xml:space="preserve">ACM </w:t>
-      </w:r>
-      <w:proofErr w:type="spellStart"/>
-      <w:r>
-        <w:rPr>
-          <w:i/>
-          <w:iCs/>
-          <w:lang w:val="sv-SE"/>
-        </w:rPr>
-        <w:t>transactions</w:t>
-      </w:r>
-      <w:proofErr w:type="spellEnd"/>
-      <w:r>
-        <w:rPr>
-          <w:i/>
-          <w:iCs/>
-          <w:lang w:val="sv-SE"/>
-        </w:rPr>
-        <w:t xml:space="preserve"> on information systems</w:t>
-      </w:r>
-      <w:r>
-        <w:rPr>
-          <w:lang w:val="sv-SE"/>
-        </w:rPr>
-        <w:t>. [</w:t>
-      </w:r>
-      <w:hyperlink r:id="rId8" w:history="1">
-        <w:r>
-          <w:rPr>
-            <w:rStyle w:val="Hyperlinkki"/>
-            <w:lang w:val="sv-SE"/>
-          </w:rPr>
-          <w:t>Online</w:t>
-        </w:r>
-      </w:hyperlink>
-      <w:r>
-        <w:rPr>
-          <w:lang w:val="sv-SE"/>
-        </w:rPr>
-        <w:t>] 22 (1), 5–53.</w:t>
-      </w:r>
-    </w:p>
-    <w:p>
-      <w:pPr>
-        <w:rPr>
-          <w:lang w:val="sv-SE"/>
-        </w:rPr>
-      </w:pPr>
-      <w:r>
-        <w:t xml:space="preserve">Rokach, L. et al. (2022) </w:t>
-      </w:r>
-      <w:r>
-        <w:rPr>
-          <w:i/>
-          <w:iCs/>
-        </w:rPr>
-        <w:t>Recommender systems handbook</w:t>
-      </w:r>
-      <w:r>
-        <w:t>. Third edition. New York, NY: Springer.</w:t>
-      </w:r>
-      <w:r>
-        <w:t xml:space="preserve"> </w:t>
-      </w:r>
-      <w:hyperlink r:id="rId9" w:history="1">
-        <w:r>
-          <w:rPr>
-            <w:rStyle w:val="Hyperlinkki"/>
-          </w:rPr>
-          <w:t>Available</w:t>
-        </w:r>
-      </w:hyperlink>
-    </w:p>
-    <w:p>
-      <w:r>
-        <w:lastRenderedPageBreak/>
-        <w:t xml:space="preserve">Sarwar, B. et al. (2001) ‘Item-based collaborative filtering recommendation algorithms’, in </w:t>
-      </w:r>
-      <w:r>
-        <w:rPr>
-          <w:i/>
-          <w:iCs/>
-        </w:rPr>
-        <w:t>Proceedings of the 10th International Conference on World Wide Web</w:t>
-      </w:r>
-      <w:r>
-        <w:t>. [</w:t>
-      </w:r>
-      <w:hyperlink r:id="rId10" w:history="1">
-        <w:r>
-          <w:rPr>
-            <w:rStyle w:val="Hyperlinkki"/>
-          </w:rPr>
-          <w:t>Onlin</w:t>
-        </w:r>
-        <w:r>
-          <w:rPr>
-            <w:rStyle w:val="Hyperlinkki"/>
-          </w:rPr>
-          <w:t>e</w:t>
-        </w:r>
-      </w:hyperlink>
-      <w:r>
-        <w:t>]. 1 April 2001 New York, NY, USA: ACM. pp. 285–295</w:t>
-      </w:r>
-    </w:p>
     <w:sectPr>
-      <w:footerReference w:type="default" r:id="rId11"/>
+      <w:footerReference w:type="default" r:id="rId8"/>
       <w:pgSz w:w="12240" w:h="15840"/>
       <w:pgMar w:top="1008" w:right="1152" w:bottom="1008" w:left="1152" w:header="720" w:footer="720" w:gutter="0"/>
       <w:pgNumType w:start="1"/>
@@ -1225,155 +815,6 @@
 <file path=word/numbering.xml><?xml version="1.0" encoding="utf-8"?>
 <w:numbering xmlns:wpc="http://schemas.microsoft.com/office/word/2010/wordprocessingCanvas" xmlns:cx="http://schemas.microsoft.com/office/drawing/2014/chartex" xmlns:cx1="http://schemas.microsoft.com/office/drawing/2015/9/8/chartex" xmlns:cx2="http://schemas.microsoft.com/office/drawing/2015/10/21/chartex" xmlns:cx3="http://schemas.microsoft.com/office/drawing/2016/5/9/chartex" xmlns:cx4="http://schemas.microsoft.com/office/drawing/2016/5/10/chartex" xmlns:cx5="http://schemas.microsoft.com/office/drawing/2016/5/11/chartex" xmlns:cx6="http://schemas.microsoft.com/office/drawing/2016/5/12/chartex" xmlns:cx7="http://schemas.microsoft.com/office/drawing/2016/5/13/chartex" xmlns:cx8="http://schemas.microsoft.com/office/drawing/2016/5/14/chartex" xmlns:mc="http://schemas.openxmlformats.org/markup-compatibility/2006" xmlns:aink="http://schemas.microsoft.com/office/drawing/2016/ink" xmlns:am3d="http://schemas.microsoft.com/office/drawing/2017/model3d" xmlns:o="urn:schemas-microsoft-com:office:office" xmlns:oel="http://schemas.microsoft.com/office/2019/extlst" xmlns:r="http://schemas.openxmlformats.org/officeDocument/2006/relationships" xmlns:m="http://schemas.openxmlformats.org/officeDocument/2006/math" xmlns:v="urn:schemas-microsoft-com:vml" xmlns:wp14="http://schemas.microsoft.com/office/word/2010/wordprocessingDrawing" xmlns:wp="http://schemas.openxmlformats.org/drawingml/2006/wordprocessingDrawing" xmlns:w10="urn:schemas-microsoft-com:office:word" xmlns:w="http://schemas.openxmlformats.org/wordprocessingml/2006/main" xmlns:w14="http://schemas.microsoft.com/office/word/2010/wordml" xmlns:w15="http://schemas.microsoft.com/office/word/2012/wordml" xmlns:w16cex="http://schemas.microsoft.com/office/word/2018/wordml/cex" xmlns:w16cid="http://schemas.microsoft.com/office/word/2016/wordml/cid" xmlns:w16="http://schemas.microsoft.com/office/word/2018/wordml" xmlns:w16du="http://schemas.microsoft.com/office/word/2023/wordml/word16du" xmlns:w16sdtdh="http://schemas.microsoft.com/office/word/2020/wordml/sdtdatahash" xmlns:w16sdtfl="http://schemas.microsoft.com/office/word/2024/wordml/sdtformatlock" xmlns:w16se="http://schemas.microsoft.com/office/word/2015/wordml/symex" xmlns:wpg="http://schemas.microsoft.com/office/word/2010/wordprocessingGroup" xmlns:wpi="http://schemas.microsoft.com/office/word/2010/wordprocessingInk" xmlns:wne="http://schemas.microsoft.com/office/word/2006/wordml" xmlns:wps="http://schemas.microsoft.com/office/word/2010/wordprocessingShape" mc:Ignorable="w14 w15 w16se w16cid w16 w16cex w16sdtdh w16sdtfl w16du wp14">
   <w:abstractNum w:abstractNumId="0" w15:restartNumberingAfterBreak="0">
-    <w:nsid w:val="119959D3"/>
-    <w:multiLevelType w:val="multilevel"/>
-    <w:tmpl w:val="789C5C00"/>
-    <w:lvl w:ilvl="0">
-      <w:start w:val="1"/>
-      <w:numFmt w:val="bullet"/>
-      <w:lvlText w:val=""/>
-      <w:lvlJc w:val="left"/>
-      <w:pPr>
-        <w:tabs>
-          <w:tab w:val="num" w:pos="720"/>
-        </w:tabs>
-        <w:ind w:left="720" w:hanging="360"/>
-      </w:pPr>
-      <w:rPr>
-        <w:rFonts w:ascii="Symbol" w:hAnsi="Symbol" w:hint="default"/>
-        <w:sz w:val="20"/>
-      </w:rPr>
-    </w:lvl>
-    <w:lvl w:ilvl="1" w:tentative="1">
-      <w:start w:val="1"/>
-      <w:numFmt w:val="bullet"/>
-      <w:lvlText w:val="o"/>
-      <w:lvlJc w:val="left"/>
-      <w:pPr>
-        <w:tabs>
-          <w:tab w:val="num" w:pos="1440"/>
-        </w:tabs>
-        <w:ind w:left="1440" w:hanging="360"/>
-      </w:pPr>
-      <w:rPr>
-        <w:rFonts w:ascii="Courier New" w:hAnsi="Courier New" w:hint="default"/>
-        <w:sz w:val="20"/>
-      </w:rPr>
-    </w:lvl>
-    <w:lvl w:ilvl="2" w:tentative="1">
-      <w:start w:val="1"/>
-      <w:numFmt w:val="bullet"/>
-      <w:lvlText w:val=""/>
-      <w:lvlJc w:val="left"/>
-      <w:pPr>
-        <w:tabs>
-          <w:tab w:val="num" w:pos="2160"/>
-        </w:tabs>
-        <w:ind w:left="2160" w:hanging="360"/>
-      </w:pPr>
-      <w:rPr>
-        <w:rFonts w:ascii="Wingdings" w:hAnsi="Wingdings" w:hint="default"/>
-        <w:sz w:val="20"/>
-      </w:rPr>
-    </w:lvl>
-    <w:lvl w:ilvl="3" w:tentative="1">
-      <w:start w:val="1"/>
-      <w:numFmt w:val="bullet"/>
-      <w:lvlText w:val=""/>
-      <w:lvlJc w:val="left"/>
-      <w:pPr>
-        <w:tabs>
-          <w:tab w:val="num" w:pos="2880"/>
-        </w:tabs>
-        <w:ind w:left="2880" w:hanging="360"/>
-      </w:pPr>
-      <w:rPr>
-        <w:rFonts w:ascii="Wingdings" w:hAnsi="Wingdings" w:hint="default"/>
-        <w:sz w:val="20"/>
-      </w:rPr>
-    </w:lvl>
-    <w:lvl w:ilvl="4" w:tentative="1">
-      <w:start w:val="1"/>
-      <w:numFmt w:val="bullet"/>
-      <w:lvlText w:val=""/>
-      <w:lvlJc w:val="left"/>
-      <w:pPr>
-        <w:tabs>
-          <w:tab w:val="num" w:pos="3600"/>
-        </w:tabs>
-        <w:ind w:left="3600" w:hanging="360"/>
-      </w:pPr>
-      <w:rPr>
-        <w:rFonts w:ascii="Wingdings" w:hAnsi="Wingdings" w:hint="default"/>
-        <w:sz w:val="20"/>
-      </w:rPr>
-    </w:lvl>
-    <w:lvl w:ilvl="5" w:tentative="1">
-      <w:start w:val="1"/>
-      <w:numFmt w:val="bullet"/>
-      <w:lvlText w:val=""/>
-      <w:lvlJc w:val="left"/>
-      <w:pPr>
-        <w:tabs>
-          <w:tab w:val="num" w:pos="4320"/>
-        </w:tabs>
-        <w:ind w:left="4320" w:hanging="360"/>
-      </w:pPr>
-      <w:rPr>
-        <w:rFonts w:ascii="Wingdings" w:hAnsi="Wingdings" w:hint="default"/>
-        <w:sz w:val="20"/>
-      </w:rPr>
-    </w:lvl>
-    <w:lvl w:ilvl="6" w:tentative="1">
-      <w:start w:val="1"/>
-      <w:numFmt w:val="bullet"/>
-      <w:lvlText w:val=""/>
-      <w:lvlJc w:val="left"/>
-      <w:pPr>
-        <w:tabs>
-          <w:tab w:val="num" w:pos="5040"/>
-        </w:tabs>
-        <w:ind w:left="5040" w:hanging="360"/>
-      </w:pPr>
-      <w:rPr>
-        <w:rFonts w:ascii="Wingdings" w:hAnsi="Wingdings" w:hint="default"/>
-        <w:sz w:val="20"/>
-      </w:rPr>
-    </w:lvl>
-    <w:lvl w:ilvl="7" w:tentative="1">
-      <w:start w:val="1"/>
-      <w:numFmt w:val="bullet"/>
-      <w:lvlText w:val=""/>
-      <w:lvlJc w:val="left"/>
-      <w:pPr>
-        <w:tabs>
-          <w:tab w:val="num" w:pos="5760"/>
-        </w:tabs>
-        <w:ind w:left="5760" w:hanging="360"/>
-      </w:pPr>
-      <w:rPr>
-        <w:rFonts w:ascii="Wingdings" w:hAnsi="Wingdings" w:hint="default"/>
-        <w:sz w:val="20"/>
-      </w:rPr>
-    </w:lvl>
-    <w:lvl w:ilvl="8" w:tentative="1">
-      <w:start w:val="1"/>
-      <w:numFmt w:val="bullet"/>
-      <w:lvlText w:val=""/>
-      <w:lvlJc w:val="left"/>
-      <w:pPr>
-        <w:tabs>
-          <w:tab w:val="num" w:pos="6480"/>
-        </w:tabs>
-        <w:ind w:left="6480" w:hanging="360"/>
-      </w:pPr>
-      <w:rPr>
-        <w:rFonts w:ascii="Wingdings" w:hAnsi="Wingdings" w:hint="default"/>
-        <w:sz w:val="20"/>
-      </w:rPr>
-    </w:lvl>
-  </w:abstractNum>
-  <w:abstractNum w:abstractNumId="1" w15:restartNumberingAfterBreak="0">
     <w:nsid w:val="440B0E77"/>
     <w:multiLevelType w:val="multilevel"/>
     <w:tmpl w:val="40AA0DB8"/>
@@ -1487,7 +928,7 @@
       </w:pPr>
     </w:lvl>
   </w:abstractNum>
-  <w:abstractNum w:abstractNumId="2" w15:restartNumberingAfterBreak="0">
+  <w:abstractNum w:abstractNumId="1" w15:restartNumberingAfterBreak="0">
     <w:nsid w:val="75A74EEB"/>
     <w:multiLevelType w:val="multilevel"/>
     <w:tmpl w:val="A5C61746"/>
@@ -1578,13 +1019,13 @@
     </w:lvl>
   </w:abstractNum>
   <w:num w:numId="1" w16cid:durableId="1577015959">
-    <w:abstractNumId w:val="2"/>
+    <w:abstractNumId w:val="1"/>
   </w:num>
   <w:num w:numId="2" w16cid:durableId="1671368213">
-    <w:abstractNumId w:val="1"/>
+    <w:abstractNumId w:val="0"/>
   </w:num>
   <w:num w:numId="3" w16cid:durableId="1838769797">
-    <w:abstractNumId w:val="1"/>
+    <w:abstractNumId w:val="0"/>
     <w:lvlOverride w:ilvl="0">
       <w:startOverride w:val="1"/>
     </w:lvlOverride>
@@ -1614,7 +1055,7 @@
     </w:lvlOverride>
   </w:num>
   <w:num w:numId="4" w16cid:durableId="1179733007">
-    <w:abstractNumId w:val="1"/>
+    <w:abstractNumId w:val="0"/>
     <w:lvlOverride w:ilvl="0">
       <w:startOverride w:val="1"/>
     </w:lvlOverride>
@@ -1644,7 +1085,7 @@
     </w:lvlOverride>
   </w:num>
   <w:num w:numId="5" w16cid:durableId="615530102">
-    <w:abstractNumId w:val="1"/>
+    <w:abstractNumId w:val="0"/>
     <w:lvlOverride w:ilvl="0">
       <w:startOverride w:val="1"/>
     </w:lvlOverride>
@@ -1674,7 +1115,7 @@
     </w:lvlOverride>
   </w:num>
   <w:num w:numId="6" w16cid:durableId="1860968829">
-    <w:abstractNumId w:val="1"/>
+    <w:abstractNumId w:val="0"/>
     <w:lvlOverride w:ilvl="0">
       <w:startOverride w:val="1"/>
     </w:lvlOverride>
@@ -1702,9 +1143,6 @@
     <w:lvlOverride w:ilvl="8">
       <w:startOverride w:val="1"/>
     </w:lvlOverride>
-  </w:num>
-  <w:num w:numId="7" w16cid:durableId="1891381724">
-    <w:abstractNumId w:val="0"/>
   </w:num>
 </w:numbering>
 </file>
@@ -13101,41 +12539,6 @@
       <w:tblStyleColBandSize w:val="1"/>
     </w:tblPr>
   </w:style>
-  <w:style w:type="character" w:styleId="Hyperlinkki">
-    <w:name w:val="Hyperlink"/>
-    <w:basedOn w:val="Kappaleenoletusfontti"/>
-    <w:uiPriority w:val="99"/>
-    <w:unhideWhenUsed/>
-    <w:rsid w:val="002C5672"/>
-    <w:rPr>
-      <w:color w:val="0000FF" w:themeColor="hyperlink"/>
-      <w:u w:val="single"/>
-    </w:rPr>
-  </w:style>
-  <w:style w:type="character" w:styleId="Ratkaisematonmaininta">
-    <w:name w:val="Unresolved Mention"/>
-    <w:basedOn w:val="Kappaleenoletusfontti"/>
-    <w:uiPriority w:val="99"/>
-    <w:semiHidden/>
-    <w:unhideWhenUsed/>
-    <w:rsid w:val="002C5672"/>
-    <w:rPr>
-      <w:color w:val="605E5C"/>
-      <w:shd w:val="clear" w:color="auto" w:fill="E1DFDD"/>
-    </w:rPr>
-  </w:style>
-  <w:style w:type="character" w:styleId="AvattuHyperlinkki">
-    <w:name w:val="FollowedHyperlink"/>
-    <w:basedOn w:val="Kappaleenoletusfontti"/>
-    <w:uiPriority w:val="99"/>
-    <w:semiHidden/>
-    <w:unhideWhenUsed/>
-    <w:rsid w:val="007A17E6"/>
-    <w:rPr>
-      <w:color w:val="800080" w:themeColor="followedHyperlink"/>
-      <w:u w:val="single"/>
-    </w:rPr>
-  </w:style>
 </w:styles>
 </file>
 

</xml_diff>

<commit_message>
updated rating histogram, report and run_all.py
</commit_message>
<xml_diff>
--- a/report_and_results/Recommender_Systems_Report.docx
+++ b/report_and_results/Recommender_Systems_Report.docx
@@ -466,22 +466,15 @@
       </w:pPr>
       <w:r>
         <w:rPr/>
-        <w:t>We also took a look at the activity (as measured by the number ratings given) across the time span of the data set which cover time period of April 2000 to February 2003 (Figure 3). Initially, the number of ratings rises rapidly so that half of them were already subscribed by around November 2000 and after a burst of activity, around 90% of the total was reached by January 2001. Afterwards, the activity flattens out. As a consequence, the ratings are not distributed evenly in time but are concentrated on relatively small period between March 2000 and January 2001.  It should also be noted that the rated movies are published between 1919 and 2000, so no movies published during the survey is not included in the data set.</w:t>
+        <w:t xml:space="preserve">We also took a look at the activity (as measured by the number ratings given) across the time span of the data set which cover time period of April 2000 to February 2003 (Figure 3). Initially, the number of ratings rises rapidly so that half of them were already subscribed by around November 2000 and after a burst of activity, around 90% of the total was reached by January 2001. Afterwards, the activity flattens out. As a consequence, the ratings are not distributed evenly in time but are concentrated on relatively small period between March 2000 and January 2001.  It should also be noted that the rated movies are published between 1919 and 2000, so no movie published during the survey </w:t>
       </w:r>
-    </w:p>
-    <w:p>
-      <w:pPr>
-        <w:pStyle w:val="normal1"/>
-        <w:rPr>
-          <w:highlight w:val="none"/>
-          <w:shd w:fill="FFFF00" w:val="clear"/>
-        </w:rPr>
-      </w:pPr>
       <w:r>
-        <w:rPr>
-          <w:shd w:fill="FFFF00" w:val="clear"/>
-        </w:rPr>
-        <w:t>TODO: discuss any non-obvious properties relevant to the experiments.</w:t>
+        <w:rPr/>
+        <w:t xml:space="preserve">is </w:t>
+      </w:r>
+      <w:r>
+        <w:rPr/>
+        <w:t>included in the data set.</w:t>
       </w:r>
     </w:p>
     <w:p>

</xml_diff>